<commit_message>
audit: tighten data and ml safeguards
</commit_message>
<xml_diff>
--- a/docs/evaluacion_codigo_fuente_2026-05-17.docx
+++ b/docs/evaluacion_codigo_fuente_2026-05-17.docx
@@ -7931,6 +7931,172 @@
         </w:tc>
       </w:tr>
     </w:tbl>
+    <w:p>
+      <w:pPr>
+        <w:spacing w:before="240" w:after="160"/>
+      </w:pPr>
+      <w:r>
+        <w:rPr>
+          <w:rFonts w:ascii="Segoe UI" w:hAnsi="Segoe UI"/>
+          <w:b/>
+          <w:sz w:val="36"/>
+        </w:rPr>
+        <w:t>14. Actualizacion de Fase 3 - Datos y ML</w:t>
+      </w:r>
+    </w:p>
+    <w:p>
+      <w:pPr>
+        <w:spacing w:after="100"/>
+      </w:pPr>
+      <w:r>
+        <w:rPr>
+          <w:rFonts w:ascii="Segoe UI" w:hAnsi="Segoe UI"/>
+          <w:sz w:val="21"/>
+        </w:rPr>
+        <w:t>Estado de validacion al cierre de Fase 3: 79 tests pasados, cobertura total 80%, con 4 warnings conocidos de scikit-learn en fixtures de pruebas ML.</w:t>
+      </w:r>
+    </w:p>
+    <w:p>
+      <w:pPr>
+        <w:spacing w:after="100"/>
+      </w:pPr>
+      <w:r>
+        <w:rPr>
+          <w:rFonts w:ascii="Segoe UI" w:hAnsi="Segoe UI"/>
+          <w:sz w:val="21"/>
+        </w:rPr>
+        <w:t>Correcciones aplicadas:</w:t>
+      </w:r>
+    </w:p>
+    <w:p>
+      <w:pPr>
+        <w:spacing w:after="60"/>
+        <w:ind w:left="360" w:hanging="216"/>
+      </w:pPr>
+      <w:r>
+        <w:rPr>
+          <w:rFonts w:ascii="Segoe UI" w:hAnsi="Segoe UI"/>
+          <w:sz w:val="21"/>
+        </w:rPr>
+        <w:t>? sync_shortlist.py valida limit, min_age y max_age antes de copiar jugadores y devuelve un resumen verificable.</w:t>
+      </w:r>
+    </w:p>
+    <w:p>
+      <w:pPr>
+        <w:spacing w:after="60"/>
+        <w:ind w:left="360" w:hanging="216"/>
+      </w:pPr>
+      <w:r>
+        <w:rPr>
+          <w:rFonts w:ascii="Segoe UI" w:hAnsi="Segoe UI"/>
+          <w:sz w:val="21"/>
+        </w:rPr>
+        <w:t>? Los checkpoints del modelo guardan seed ademas de input_dim; la carga mantiene validacion de compatibilidad con el preprocesador.</w:t>
+      </w:r>
+    </w:p>
+    <w:p>
+      <w:pPr>
+        <w:spacing w:after="60"/>
+        <w:ind w:left="360" w:hanging="216"/>
+      </w:pPr>
+      <w:r>
+        <w:rPr>
+          <w:rFonts w:ascii="Segoe UI" w:hAnsi="Segoe UI"/>
+          <w:sz w:val="21"/>
+        </w:rPr>
+        <w:t>? El DataLoader y el sampler del entrenamiento usan generadores con seed explicito.</w:t>
+      </w:r>
+    </w:p>
+    <w:p>
+      <w:pPr>
+        <w:spacing w:after="60"/>
+        <w:ind w:left="360" w:hanging="216"/>
+      </w:pPr>
+      <w:r>
+        <w:rPr>
+          <w:rFonts w:ascii="Segoe UI" w:hAnsi="Segoe UI"/>
+          <w:sz w:val="21"/>
+        </w:rPr>
+        <w:t>? Metricas, calibradores y runtime ML registran warnings cuando caen a fallback.</w:t>
+      </w:r>
+    </w:p>
+    <w:p>
+      <w:pPr>
+        <w:spacing w:after="60"/>
+        <w:ind w:left="360" w:hanging="216"/>
+      </w:pPr>
+      <w:r>
+        <w:rPr>
+          <w:rFonts w:ascii="Segoe UI" w:hAnsi="Segoe UI"/>
+          <w:sz w:val="21"/>
+        </w:rPr>
+        <w:t>? RUNBOOK y pendientes documentan migraciones manuales, cache in-memory y riesgos restantes.</w:t>
+      </w:r>
+    </w:p>
+    <w:p>
+      <w:pPr>
+        <w:spacing w:after="100"/>
+      </w:pPr>
+      <w:r>
+        <w:rPr>
+          <w:rFonts w:ascii="Segoe UI" w:hAnsi="Segoe UI"/>
+          <w:sz w:val="21"/>
+        </w:rPr>
+        <w:t>Riesgos restantes no corregidos en Fase 3:</w:t>
+      </w:r>
+    </w:p>
+    <w:p>
+      <w:pPr>
+        <w:spacing w:after="60"/>
+        <w:ind w:left="360" w:hanging="216"/>
+      </w:pPr>
+      <w:r>
+        <w:rPr>
+          <w:rFonts w:ascii="Segoe UI" w:hAnsi="Segoe UI"/>
+          <w:sz w:val="21"/>
+        </w:rPr>
+        <w:t>? Las migraciones siguen siendo manuales; Alembic queda fuera del alcance MVP.</w:t>
+      </w:r>
+    </w:p>
+    <w:p>
+      <w:pPr>
+        <w:spacing w:after="60"/>
+        <w:ind w:left="360" w:hanging="216"/>
+      </w:pPr>
+      <w:r>
+        <w:rPr>
+          <w:rFonts w:ascii="Segoe UI" w:hAnsi="Segoe UI"/>
+          <w:sz w:val="21"/>
+        </w:rPr>
+        <w:t>? El cache sigue siendo in-memory y no distribuido.</w:t>
+      </w:r>
+    </w:p>
+    <w:p>
+      <w:pPr>
+        <w:spacing w:after="60"/>
+        <w:ind w:left="360" w:hanging="216"/>
+      </w:pPr>
+      <w:r>
+        <w:rPr>
+          <w:rFonts w:ascii="Segoe UI" w:hAnsi="Segoe UI"/>
+          <w:sz w:val="21"/>
+        </w:rPr>
+        <w:t>? La validacion predictiva sigue dependiendo de dataset sintetico.</w:t>
+      </w:r>
+    </w:p>
+    <w:p>
+      <w:pPr>
+        <w:spacing w:after="60"/>
+        <w:ind w:left="360" w:hanging="216"/>
+      </w:pPr>
+      <w:r>
+        <w:rPr>
+          <w:rFonts w:ascii="Segoe UI" w:hAnsi="Segoe UI"/>
+          <w:sz w:val="21"/>
+        </w:rPr>
+        <w:t>? El smoke real de Render con datos cargados sigue pendiente si la demo sera cloud.</w:t>
+      </w:r>
+    </w:p>
     <w:sectPr>
       <w:pgSz w:w="12240" w:h="15840"/>
       <w:pgMar w:top="1008" w:right="1080" w:bottom="1008" w:left="1080" w:header="720" w:footer="720" w:gutter="0"/>

</xml_diff>

<commit_message>
test: publish coverage and expand audit checks
</commit_message>
<xml_diff>
--- a/docs/evaluacion_codigo_fuente_2026-05-17.docx
+++ b/docs/evaluacion_codigo_fuente_2026-05-17.docx
@@ -8097,6 +8097,159 @@
         <w:t>? El smoke real de Render con datos cargados sigue pendiente si la demo sera cloud.</w:t>
       </w:r>
     </w:p>
+    <w:p>
+      <w:pPr>
+        <w:spacing w:before="240" w:after="160"/>
+      </w:pPr>
+      <w:r>
+        <w:rPr>
+          <w:rFonts w:ascii="Segoe UI" w:hAnsi="Segoe UI"/>
+          <w:b/>
+          <w:sz w:val="36"/>
+        </w:rPr>
+        <w:t>15. Actualizacion de Fase 4 - Testing y CI</w:t>
+      </w:r>
+    </w:p>
+    <w:p>
+      <w:pPr>
+        <w:spacing w:after="100"/>
+      </w:pPr>
+      <w:r>
+        <w:rPr>
+          <w:rFonts w:ascii="Segoe UI" w:hAnsi="Segoe UI"/>
+          <w:sz w:val="21"/>
+        </w:rPr>
+        <w:t>Estado de validacion al cierre de Fase 4: 82 tests pasados, cobertura total 80%, con 4 warnings conocidos de scikit-learn en fixtures de pruebas ML.</w:t>
+      </w:r>
+    </w:p>
+    <w:p>
+      <w:pPr>
+        <w:spacing w:after="100"/>
+      </w:pPr>
+      <w:r>
+        <w:rPr>
+          <w:rFonts w:ascii="Segoe UI" w:hAnsi="Segoe UI"/>
+          <w:sz w:val="21"/>
+        </w:rPr>
+        <w:t>Correcciones aplicadas:</w:t>
+      </w:r>
+    </w:p>
+    <w:p>
+      <w:pPr>
+        <w:spacing w:after="60"/>
+        <w:ind w:left="360" w:hanging="216"/>
+      </w:pPr>
+      <w:r>
+        <w:rPr>
+          <w:rFonts w:ascii="Segoe UI" w:hAnsi="Segoe UI"/>
+          <w:sz w:val="21"/>
+        </w:rPr>
+        <w:t>? GitHub Actions genera coverage.xml y lo sube como artefacto por version de Python.</w:t>
+      </w:r>
+    </w:p>
+    <w:p>
+      <w:pPr>
+        <w:spacing w:after="60"/>
+        <w:ind w:left="360" w:hanging="216"/>
+      </w:pPr>
+      <w:r>
+        <w:rPr>
+          <w:rFonts w:ascii="Segoe UI" w:hAnsi="Segoe UI"/>
+          <w:sz w:val="21"/>
+        </w:rPr>
+        <w:t>? Se reforzaron tests de rutas protegidas sin login para jugadores, dashboard, comparadores, settings, importacion y prediccion.</w:t>
+      </w:r>
+    </w:p>
+    <w:p>
+      <w:pPr>
+        <w:spacing w:after="60"/>
+        <w:ind w:left="360" w:hanging="216"/>
+      </w:pPr>
+      <w:r>
+        <w:rPr>
+          <w:rFonts w:ascii="Segoe UI" w:hAnsi="Segoe UI"/>
+          <w:sz w:val="21"/>
+        </w:rPr>
+        <w:t>? Se agrego test de alta de jugador con atributo por debajo del rango funcional actual.</w:t>
+      </w:r>
+    </w:p>
+    <w:p>
+      <w:pPr>
+        <w:spacing w:after="60"/>
+        <w:ind w:left="360" w:hanging="216"/>
+      </w:pPr>
+      <w:r>
+        <w:rPr>
+          <w:rFonts w:ascii="Segoe UI" w:hAnsi="Segoe UI"/>
+          <w:sz w:val="21"/>
+        </w:rPr>
+        <w:t>? Se agrego test de prediccion cuando no hay modelo cargado, verificando error controlado.</w:t>
+      </w:r>
+    </w:p>
+    <w:p>
+      <w:pPr>
+        <w:spacing w:after="60"/>
+        <w:ind w:left="360" w:hanging="216"/>
+      </w:pPr>
+      <w:r>
+        <w:rPr>
+          <w:rFonts w:ascii="Segoe UI" w:hAnsi="Segoe UI"/>
+          <w:sz w:val="21"/>
+        </w:rPr>
+        <w:t>? README_TESTS documenta comando de cobertura, estado actual y alcance de pruebas.</w:t>
+      </w:r>
+    </w:p>
+    <w:p>
+      <w:pPr>
+        <w:spacing w:after="100"/>
+      </w:pPr>
+      <w:r>
+        <w:rPr>
+          <w:rFonts w:ascii="Segoe UI" w:hAnsi="Segoe UI"/>
+          <w:sz w:val="21"/>
+        </w:rPr>
+        <w:t>Riesgos/decisiones restantes:</w:t>
+      </w:r>
+    </w:p>
+    <w:p>
+      <w:pPr>
+        <w:spacing w:after="60"/>
+        <w:ind w:left="360" w:hanging="216"/>
+      </w:pPr>
+      <w:r>
+        <w:rPr>
+          <w:rFonts w:ascii="Segoe UI" w:hAnsi="Segoe UI"/>
+          <w:sz w:val="21"/>
+        </w:rPr>
+        <w:t>? La regla funcional actual de atributos es 0-20. Si el documento academico final afirma 1-20, debe alinearse en documento o codigo.</w:t>
+      </w:r>
+    </w:p>
+    <w:p>
+      <w:pPr>
+        <w:spacing w:after="60"/>
+        <w:ind w:left="360" w:hanging="216"/>
+      </w:pPr>
+      <w:r>
+        <w:rPr>
+          <w:rFonts w:ascii="Segoe UI" w:hAnsi="Segoe UI"/>
+          <w:sz w:val="21"/>
+        </w:rPr>
+        <w:t>? create_admin.py sigue con baja cobertura; no bloquea el MVP porque el bootstrap principal se valida desde app.py.</w:t>
+      </w:r>
+    </w:p>
+    <w:p>
+      <w:pPr>
+        <w:spacing w:after="60"/>
+        <w:ind w:left="360" w:hanging="216"/>
+      </w:pPr>
+      <w:r>
+        <w:rPr>
+          <w:rFonts w:ascii="Segoe UI" w:hAnsi="Segoe UI"/>
+          <w:sz w:val="21"/>
+        </w:rPr>
+        <w:t>? No hay tests visuales Playwright; quedan como mejora futura si se prioriza responsive/UX en navegador real.</w:t>
+      </w:r>
+    </w:p>
     <w:sectPr>
       <w:pgSz w:w="12240" w:h="15840"/>
       <w:pgMar w:top="1008" w:right="1080" w:bottom="1008" w:left="1080" w:header="720" w:footer="720" w:gutter="0"/>

</xml_diff>

<commit_message>
audit: align attribute scale and add smoke checks
</commit_message>
<xml_diff>
--- a/docs/evaluacion_codigo_fuente_2026-05-17.docx
+++ b/docs/evaluacion_codigo_fuente_2026-05-17.docx
@@ -8217,11 +8217,7 @@
         <w:ind w:left="360" w:hanging="216"/>
       </w:pPr>
       <w:r>
-        <w:rPr>
-          <w:rFonts w:ascii="Segoe UI" w:hAnsi="Segoe UI"/>
-          <w:sz w:val="21"/>
-        </w:rPr>
-        <w:t>? La regla funcional actual de atributos es 0-20. Si el documento academico final afirma 1-20, debe alinearse en documento o codigo.</w:t>
+        <w:t>- La regla funcional actual de atributos es 1-20. Se alinearon validaciones, UI, generacion sintetica, migracion de valores heredados y tests para que coincida con el documento academico final.</w:t>
       </w:r>
     </w:p>
     <w:p>
@@ -8248,6 +8244,62 @@
           <w:sz w:val="21"/>
         </w:rPr>
         <w:t>? No hay tests visuales Playwright; quedan como mejora futura si se prioriza responsive/UX en navegador real.</w:t>
+      </w:r>
+    </w:p>
+    <w:p>
+      <w:pPr>
+        <w:pStyle w:val="Heading2"/>
+      </w:pPr>
+      <w:r>
+        <w:t>16. Actualizacion de escala y smoke tests - 2026-05-17</w:t>
+      </w:r>
+    </w:p>
+    <w:p>
+      <w:pPr>
+        <w:pStyle w:val="ListBullet"/>
+      </w:pPr>
+      <w:r>
+        <w:t>Se centralizo el rango de atributos en codigo como 1-20 y se ajustaron formularios, importacion CSV, historial tecnico, reportes scout y campos fisicos expresados en escala.</w:t>
+      </w:r>
+    </w:p>
+    <w:p>
+      <w:pPr>
+        <w:pStyle w:val="ListBullet"/>
+      </w:pPr>
+      <w:r>
+        <w:t>ensure_player_columns normaliza datos heredados fuera de rango: valores menores a 1 pasan a 1 y valores mayores a 20 pasan a 20, preservando NULL cuando el campo es opcional.</w:t>
+      </w:r>
+    </w:p>
+    <w:p>
+      <w:pPr>
+        <w:pStyle w:val="ListBullet"/>
+      </w:pPr>
+      <w:r>
+        <w:t>Se agrego un smoke visual opt-in con Playwright: al activarlo con RUN_PLAYWRIGHT=1 abre Chromium real, valida login, dashboard y responsive basico sin overflow horizontal.</w:t>
+      </w:r>
+    </w:p>
+    <w:p>
+      <w:pPr>
+        <w:pStyle w:val="ListBullet"/>
+      </w:pPr>
+      <w:r>
+        <w:t>Se agrego scripts/smoke_render.py para validar el despliegue real en Render contra /health, /login y, si se proveen credenciales, /dashboard autenticado.</w:t>
+      </w:r>
+    </w:p>
+    <w:p>
+      <w:pPr>
+        <w:pStyle w:val="ListBullet"/>
+      </w:pPr>
+      <w:r>
+        <w:t>No se encontro en el repositorio una URL publica fija de Render; el smoke real requiere RENDER_SMOKE_BASE_URL con la URL del servicio desplegado.</w:t>
+      </w:r>
+    </w:p>
+    <w:p>
+      <w:pPr>
+        <w:pStyle w:val="ListBullet"/>
+      </w:pPr>
+      <w:r>
+        <w:t>Se normalizaron tambien las bases locales de demo players_updated_v2.db y players_training.db, con backup previo *.db.before_attr_scale_1_20_YYYYMMDD_HHMMSS. Los archivos .db continuan fuera de Git.</w:t>
       </w:r>
     </w:p>
     <w:sectPr>

</xml_diff>

<commit_message>
docs: close phase 5 quality updates
</commit_message>
<xml_diff>
--- a/docs/evaluacion_codigo_fuente_2026-05-17.docx
+++ b/docs/evaluacion_codigo_fuente_2026-05-17.docx
@@ -8302,6 +8302,54 @@
         <w:t>Se normalizaron tambien las bases locales de demo players_updated_v2.db y players_training.db, con backup previo *.db.before_attr_scale_1_20_YYYYMMDD_HHMMSS. Los archivos .db continuan fuera de Git.</w:t>
       </w:r>
     </w:p>
+    <w:p>
+      <w:pPr>
+        <w:pStyle w:val="Heading2"/>
+      </w:pPr>
+      <w:r>
+        <w:t>17. Actualizacion de Fase 5 - Calidad y documentacion - 2026-05-18</w:t>
+      </w:r>
+    </w:p>
+    <w:p>
+      <w:pPr>
+        <w:pStyle w:val="ListBullet"/>
+      </w:pPr>
+      <w:r>
+        <w:t>Se actualizo la documentacion operativa y tecnica principal para reflejar la rama actual ux-crud-polish, la escala funcional 1-20 y el cierre de auditoria mergeado.</w:t>
+      </w:r>
+    </w:p>
+    <w:p>
+      <w:pPr>
+        <w:pStyle w:val="ListBullet"/>
+      </w:pPr>
+      <w:r>
+        <w:t>Se agregaron constantes nombradas adicionales en app.py para cupo operativo, cantidad default de dataset, stale time del lock de pipeline, sugerencias y bandas de score.</w:t>
+      </w:r>
+    </w:p>
+    <w:p>
+      <w:pPr>
+        <w:pStyle w:val="ListBullet"/>
+      </w:pPr>
+      <w:r>
+        <w:t>Se agrego un type hint puntual en el helper de ordenamiento usado para recortar la base operativa.</w:t>
+      </w:r>
+    </w:p>
+    <w:p>
+      <w:pPr>
+        <w:pStyle w:val="ListBullet"/>
+      </w:pPr>
+      <w:r>
+        <w:t>Se mantiene el alcance MVP: no se abrio un refactor grande ni se cambiaron endpoints existentes.</w:t>
+      </w:r>
+    </w:p>
+    <w:p>
+      <w:pPr>
+        <w:pStyle w:val="ListBullet"/>
+      </w:pPr>
+      <w:r>
+        <w:t>Riesgos restantes: smoke real de Render pendiente hasta contar con URL real, cache/rate limiting/lock in-memory, migraciones manuales sin Alembic, validacion ML sintetica y alineacion final del documento de tesis.</w:t>
+      </w:r>
+    </w:p>
     <w:sectPr>
       <w:pgSz w:w="12240" w:h="15840"/>
       <w:pgMar w:top="1008" w:right="1080" w:bottom="1008" w:left="1080" w:header="720" w:footer="720" w:gutter="0"/>

</xml_diff>